<commit_message>
Update credentials, positioning, SEO, and accessibility
</commit_message>
<xml_diff>
--- a/documents/Andrew_Gurry_Resume_IG_KM_IT.docx
+++ b/documents/Andrew_Gurry_Resume_IG_KM_IT.docx
@@ -70,7 +70,7 @@
         <w:spacing w:before="0" w:after="60" w:line="240" w:lineRule="auto"/>
       </w:pPr>
       <w:r>
-        <w:t>Senior Army leader with 25+ years of experience in Inspector General operations, knowledge management, operations, training management, logistics, maritime operations, deployment leadership, compliance systems, and process improvement. Current Knowledge Management Officer for 4th Brigade (MI) and former Inspector General NCOIC with a record of turning complex, recurring problems into clear systems: workflows, dashboards, trackers, SOPs, training programs, reporting tools, inspection products, and practical automation. Strong fit for DoD Inspector General, oversight, compliance, knowledge management, process-improvement consulting, IT support, business analysis, and automation roles.</w:t>
+        <w:t>Senior Army leader with 25+ years of experience in Inspector General operations, knowledge management, operations, training management, logistics, maritime operations, deployment leadership, compliance systems, and process improvement. Current Knowledge Management Officer for 1st Brigade (Multi-Functional Training), 95th Training Division and former Inspector General NCOIC with a record of turning complex, recurring problems into clear systems: workflows, dashboards, trackers, SOPs, training programs, reporting tools, inspection products, and practical automation. Strong fit for DoD Inspector General, oversight, compliance, knowledge management, process-improvement consulting, IT support, business analysis, and automation roles.</w:t>
       </w:r>
     </w:p>
     <w:p>
@@ -385,7 +385,7 @@
           <w:color w:val="111827"/>
           <w:sz w:val="19"/>
         </w:rPr>
-        <w:t>Knowledge Management Officer</w:t>
+        <w:t>Knowledge Management Officer | 1st Brigade (Multi-Functional Training), 95th Training Division / USAR Military Intelligence Center, Fort Huachuca, AZ | 2025-Present</w:t>
       </w:r>
       <w:r>
         <w:rPr>
@@ -394,7 +394,6 @@
           <w:color w:val="374151"/>
           <w:sz w:val="18"/>
         </w:rPr>
-        <w:t xml:space="preserve"> | 4th Brigade (MI), 102nd Training Division (MS) / USAR Military Intelligence Center, Fort Huachuca, AZ | 2025-Present</w:t>
       </w:r>
     </w:p>
     <w:p>
@@ -1202,11 +1201,9 @@
         <w:rPr>
           <w:b/>
         </w:rPr>
-        <w:t xml:space="preserve">• </w:t>
+        <w:t>• CompTIA A+ certified; Microsoft PL-900, CompTIA Network+, and CompTIA Security+ planned.</w:t>
       </w:r>
-      <w:r>
-        <w:t>CompTIA A+ Core 1 passed with score of 819; currently studying for Core 2.</w:t>
-      </w:r>
+      <w:r/>
     </w:p>
     <w:p>
       <w:pPr>
@@ -1356,6 +1353,8 @@
       </w:r>
     </w:p>
     <w:sectPr>
+      <w:headerReference w:type="default" r:id="rId9"/>
+      <w:footerReference w:type="default" r:id="rId10"/>
       <w:pgSz w:w="12240" w:h="15840"/>
       <w:pgMar w:top="648" w:right="792" w:bottom="648" w:left="792" w:header="720" w:footer="720" w:gutter="0"/>
       <w:cols w:space="720"/>
@@ -1363,6 +1362,26 @@
     </w:sectPr>
   </w:body>
 </w:document>
+</file>
+
+<file path=word/footer1.xml><?xml version="1.0" encoding="utf-8"?>
+<w:ftr xmlns:m="http://schemas.openxmlformats.org/officeDocument/2006/math" xmlns:mc="http://schemas.openxmlformats.org/markup-compatibility/2006" xmlns:mo="http://schemas.microsoft.com/office/mac/office/2008/main" xmlns:mv="urn:schemas-microsoft-com:mac:vml" xmlns:o="urn:schemas-microsoft-com:office:office" xmlns:r="http://schemas.openxmlformats.org/officeDocument/2006/relationships" xmlns:v="urn:schemas-microsoft-com:vml" xmlns:w10="urn:schemas-microsoft-com:office:word" xmlns:w14="http://schemas.microsoft.com/office/word/2010/wordml" xmlns:w="http://schemas.openxmlformats.org/wordprocessingml/2006/main" xmlns:wne="http://schemas.microsoft.com/office/word/2006/wordml" xmlns:wp14="http://schemas.microsoft.com/office/word/2010/wordprocessingDrawing" xmlns:wp="http://schemas.openxmlformats.org/drawingml/2006/wordprocessingDrawing" xmlns:wpc="http://schemas.microsoft.com/office/word/2010/wordprocessingCanvas" xmlns:wpg="http://schemas.microsoft.com/office/word/2010/wordprocessingGroup" xmlns:wpi="http://schemas.microsoft.com/office/word/2010/wordprocessingInk" xmlns:wps="http://schemas.microsoft.com/office/word/2010/wordprocessingShape" mc:Ignorable="w14 wp14">
+  <w:p>
+    <w:pPr>
+      <w:pStyle w:val="Footer"/>
+    </w:pPr>
+  </w:p>
+</w:ftr>
+</file>
+
+<file path=word/header1.xml><?xml version="1.0" encoding="utf-8"?>
+<w:hdr xmlns:m="http://schemas.openxmlformats.org/officeDocument/2006/math" xmlns:mc="http://schemas.openxmlformats.org/markup-compatibility/2006" xmlns:mo="http://schemas.microsoft.com/office/mac/office/2008/main" xmlns:mv="urn:schemas-microsoft-com:mac:vml" xmlns:o="urn:schemas-microsoft-com:office:office" xmlns:r="http://schemas.openxmlformats.org/officeDocument/2006/relationships" xmlns:v="urn:schemas-microsoft-com:vml" xmlns:w10="urn:schemas-microsoft-com:office:word" xmlns:w14="http://schemas.microsoft.com/office/word/2010/wordml" xmlns:w="http://schemas.openxmlformats.org/wordprocessingml/2006/main" xmlns:wne="http://schemas.microsoft.com/office/word/2006/wordml" xmlns:wp14="http://schemas.microsoft.com/office/word/2010/wordprocessingDrawing" xmlns:wp="http://schemas.openxmlformats.org/drawingml/2006/wordprocessingDrawing" xmlns:wpc="http://schemas.microsoft.com/office/word/2010/wordprocessingCanvas" xmlns:wpg="http://schemas.microsoft.com/office/word/2010/wordprocessingGroup" xmlns:wpi="http://schemas.microsoft.com/office/word/2010/wordprocessingInk" xmlns:wps="http://schemas.microsoft.com/office/word/2010/wordprocessingShape" mc:Ignorable="w14 wp14">
+  <w:p>
+    <w:pPr>
+      <w:pStyle w:val="Header"/>
+    </w:pPr>
+  </w:p>
+</w:hdr>
 </file>
 
 <file path=word/numbering.xml><?xml version="1.0" encoding="utf-8"?>

</xml_diff>